<commit_message>
Add Projects page (Admin only, plain layout)
- database/002_projects.sql: projects table (DATE columns, NUMERIC money,
  sector/status checks, target/completed after start), applied by the
  setup tool.
- Project model; ProjectService: list/search/filter, add, edit, delete
  (only while nothing links to it), automatic completion date when Done,
  days/revenue/expenses/profit summary (expenses filled in by later parts).
- Shared AuditService for Edit History rows (UserAdmin and Account use it).
- ExcelExport (ClosedXML) and ProjectReport (print preview / Print to PDF).
- 23 checks passed against the real database (test data removed).
- Guides: Developer Guide chapter 13, User Manual Projects, UI guide,
  Project Outline line on the automatic completion date.

Co-Authored-By: Claude Opus 5.5 <noreply@anthropic.com>
</commit_message>
<xml_diff>
--- a/docs/Project Outline.docx
+++ b/docs/Project Outline.docx
@@ -982,6 +982,17 @@
       <w:r>
         <w:lastRenderedPageBreak/>
         <w:t>Fields: Project Name, Site / Location, Client, Sector, Contract Price, Start Date, Target End Date, Status (Pending, Ongoing, Done, Cancelled).</w:t>
+      </w:r>
+    </w:p>
+    <w:p>
+      <w:pPr>
+        <w:numPr>
+          <w:ilvl w:val="0"/>
+          <w:numId w:val="5"/>
+        </w:numPr>
+      </w:pPr>
+      <w:r>
+        <w:t>Completion date is recorded automatically when the status is set to Done (cleared if reopened). Days shown: Day N while running, Finished in N days when done.</w:t>
       </w:r>
     </w:p>
     <w:p>

</xml_diff>

<commit_message>
Add HR & Payroll page with the Employees tab (plain layout)
- database/003_employees.sql: employees (office staff + site workers,
  pay schedule follows department), employee_rates (dated daily-rate
  history), users.employee_id foreign key.
- EmployeeService: Admin/HR only; add, edit, dated rate changes (same
  date corrected, history kept), unique biometric IDs, Mark Inactive turns
  linked logins off, Reactivate leaves them off; Edit History filed under
  HR & Payroll without government ID numbers.
- HrPayrollPage (7 tabs, Settings/Edit History for Admin + HR Supervisor)
  and Pages/Hr/EmployeesTab.
- docs/_tools/designer-gen: generator for large designer files.
- 23 checks passed against the real database (test data removed).
- Guides: Developer Guide chapter 14, User Manual HR Employees, UI guide,
  Project Outline line on departments and pay schedules.

Co-Authored-By: Claude Opus 5.5 <noreply@anthropic.com>
</commit_message>
<xml_diff>
--- a/docs/Project Outline.docx
+++ b/docs/Project Outline.docx
@@ -1083,6 +1083,17 @@
       </w:pPr>
       <w:r>
         <w:t>Also stores: Daily Rate, Biometric ID (the number the scanner gives each person), and a Government Deductions On/Off switch (Off by default; SSS, PhilHealth, Pag-IBIG and TIN fields are optional).</w:t>
+      </w:r>
+    </w:p>
+    <w:p>
+      <w:pPr>
+        <w:numPr>
+          <w:ilvl w:val="2"/>
+          <w:numId w:val="11"/>
+        </w:numPr>
+      </w:pPr>
+      <w:r>
+        <w:t>Departments for employees: Administration, HR &amp; Payroll, Inventory, Subcontractors, Receipts, or Site (site workers). The pay schedule follows the department: Site = weekly (Saturday), all others = 15th and 30th.</w:t>
       </w:r>
     </w:p>
     <w:p>

</xml_diff>

<commit_message>
Link logins to employees in User Accounts; fix "Add" jumping to edit
- database/004: one login per employee (unique index on users.employee_id).
- UserAdminService: logins pick an Active office employee (not site
  workers), take its name and department (none for Admins;
  Administration staff only as Admin); old unlinked accounts may stay
  unlinked; HR renames / department moves flow to the login, and moving
  a Supervisor/Employee login's employee to Site/Administration is refused.
- UserAccountsPage: Employee dropdown, shown-only department, username
  suggestion that keeps Filipino surname particles (jdelacruz).
- Fix: User Accounts, Projects and Employees read SelectedRows instead of
  CurrentRow, so Create/Add no longer jumps back to editing the first row.
- 29 checks passed (test data removed). Guides: Developer Guide ch. 15,
  User Manual, UI guide, Project Outline line on one login per employee.

Co-Authored-By: Claude Opus 5.5 <noreply@anthropic.com>
</commit_message>
<xml_diff>
--- a/docs/Project Outline.docx
+++ b/docs/Project Outline.docx
@@ -920,6 +920,17 @@
         </w:numPr>
       </w:pPr>
       <w:r>
+        <w:t>Each login belongs to one Active office employee (picked from HR &amp; Payroll &gt; Employees; never site workers). One login per employee. The login's name and department come from the employee record.</w:t>
+      </w:r>
+    </w:p>
+    <w:p>
+      <w:pPr>
+        <w:numPr>
+          <w:ilvl w:val="0"/>
+          <w:numId w:val="1"/>
+        </w:numPr>
+      </w:pPr>
+      <w:r>
         <w:t>Account locks after 5 wrong passwords. Only Admin can unlock it.</w:t>
       </w:r>
     </w:p>
@@ -969,6 +980,7 @@
         </w:numPr>
       </w:pPr>
       <w:r>
+        <w:lastRenderedPageBreak/>
         <w:t>Admin only: only Admin can open this page and add, edit or delete projects. Supervisors and Employees pick a project from a dropdown inside their own department pages.</w:t>
       </w:r>
     </w:p>
@@ -980,7 +992,6 @@
         </w:numPr>
       </w:pPr>
       <w:r>
-        <w:lastRenderedPageBreak/>
         <w:t>Fields: Project Name, Site / Location, Client, Sector, Contract Price, Start Date, Target End Date, Status (Pending, Ongoing, Done, Cancelled).</w:t>
       </w:r>
     </w:p>
@@ -1241,6 +1252,7 @@
         </w:numPr>
       </w:pPr>
       <w:r>
+        <w:lastRenderedPageBreak/>
         <w:t>Work hours: 8:00 AM to 5:00 PM, Monday to Saturday, 12:00 to 1:00 PM unpaid lunch. On time up to 8:15 AM. (Editable settings.)</w:t>
       </w:r>
     </w:p>
@@ -1558,6 +1570,7 @@
         <w:rPr>
           <w:color w:val="FF9900"/>
         </w:rPr>
+        <w:lastRenderedPageBreak/>
         <w:t>Using materials: the Inventory Employee records what was used and on which project (e.g. 20 bags of cement to Santos Residence). The Inventory Supervisor approves it; then the stock goes down and the cost is added to that project.</w:t>
       </w:r>
     </w:p>
@@ -1873,6 +1886,7 @@
         </w:numPr>
       </w:pPr>
       <w:r>
+        <w:lastRenderedPageBreak/>
         <w:t>​</w:t>
       </w:r>
       <w:r>
@@ -2209,6 +2223,7 @@
           <w:b/>
           <w:bCs/>
         </w:rPr>
+        <w:lastRenderedPageBreak/>
         <w:t>Metadata Fields:</w:t>
       </w:r>
       <w:r>

</xml_diff>

<commit_message>
Attendance rules approved by the owner
The lunch-overstay, early-leave, 30-minute overtime, 3-minute repeat
scan and Sunday rules are now recorded as owner-approved in CLAUDE.md
and the Project Outline.

Co-Authored-By: Claude Opus 5.5 <noreply@anthropic.com>
</commit_message>
<xml_diff>
--- a/docs/Project Outline.docx
+++ b/docs/Project Outline.docx
@@ -1200,7 +1200,6 @@
         </w:numPr>
       </w:pPr>
       <w:r>
-        <w:lastRenderedPageBreak/>
         <w:t>Add,Edit,Delete Employee Details</w:t>
       </w:r>
     </w:p>
@@ -1330,7 +1329,7 @@
         </w:numPr>
       </w:pPr>
       <w:r>
-        <w:t>Defaults chosen while building (can be changed): coming back from lunch after 1:00 PM also counts as late minutes; leaving before 5:00 PM counts as early minutes; overtime counts from 30 minutes after 5:00 PM; two scans within 3 minutes count once; Sunday scans are "Rest Day Work" waiting for overtime approval.</w:t>
+        <w:t>Rules approved by the owner (Oct 30, 2026): coming back from lunch after 1:00 PM also counts as late minutes; leaving before 5:00 PM counts as early minutes; overtime counts from 30 minutes after 5:00 PM; two scans within 3 minutes count once; Sunday scans are "Rest Day Work" waiting for overtime approval.</w:t>
       </w:r>
     </w:p>
     <w:p>
@@ -1850,7 +1849,6 @@
           <w:b/>
           <w:bCs/>
         </w:rPr>
-        <w:lastRenderedPageBreak/>
         <w:t>Module 4: Subcontractor Management</w:t>
       </w:r>
     </w:p>
@@ -2196,7 +2194,6 @@
         </w:numPr>
       </w:pPr>
       <w:r>
-        <w:lastRenderedPageBreak/>
         <w:t>Vouchers are numbered SV-0001, SV-0002... A payout is the approved voucher's exact amount. The retention gets its own voucher once progress is 100% and every stage is paid.</w:t>
       </w:r>
     </w:p>
@@ -2518,7 +2515,6 @@
         </w:numPr>
       </w:pPr>
       <w:r>
-        <w:lastRenderedPageBreak/>
         <w:t>Change Orders (client-requested changes)</w:t>
       </w:r>
     </w:p>

</xml_diff>

<commit_message>
Payroll defaults approved by the owner
Holiday pay (Regular paid, Special unpaid, worked holiday = normal day),
early leave deducted like late, 2025 government deduction rates and
approver-only finalize are now recorded as owner-approved in CLAUDE.md
and the Project Outline.

Co-Authored-By: Claude Opus 5.5 <noreply@anthropic.com>
</commit_message>
<xml_diff>
--- a/docs/Project Outline.docx
+++ b/docs/Project Outline.docx
@@ -1200,6 +1200,7 @@
         </w:numPr>
       </w:pPr>
       <w:r>
+        <w:lastRenderedPageBreak/>
         <w:t>Add,Edit,Delete Employee Details</w:t>
       </w:r>
     </w:p>
@@ -1425,6 +1426,7 @@
         </w:numPr>
       </w:pPr>
       <w:r>
+        <w:lastRenderedPageBreak/>
         <w:t>February: the 30th payday moves to the last day of the month. If payday falls on a Sunday or holiday, pay the day before. (Defaults; can be changed.)</w:t>
       </w:r>
     </w:p>
@@ -1535,7 +1537,7 @@
         </w:numPr>
       </w:pPr>
       <w:r>
-        <w:t>Defaults chosen while building (to confirm): a Regular holiday not worked is paid, a Special holiday is not, and work on a holiday is paid as a normal day; leaving early is deducted like late minutes; government deductions use a monthly basis of daily rate x 26 days with the 2025 employee shares (SSS 5% of the salary credit, PhilHealth 2.5%, Pag-IBIG 2% up to 10,000), half per office payday and 12/52 per site payday, plus income tax from the TRAIN table. All rates are editable in Settings; the accountant should check them.</w:t>
+        <w:t>Rules approved by the owner (Oct 30, 2026): a Regular holiday not worked is paid, a Special holiday is not, and work on a holiday is paid as a normal day; leaving early is deducted like late minutes; government deductions use a monthly basis of daily rate x 26 days with the 2025 employee shares (SSS 5% of the salary credit, PhilHealth 2.5%, Pag-IBIG 2% up to 10,000), half per office payday and 12/52 per site payday, plus income tax from the TRAIN table. All rates are editable in Settings; the accountant should check them.</w:t>
       </w:r>
     </w:p>
     <w:p>
@@ -1668,6 +1670,7 @@
         <w:rPr>
           <w:color w:val="FF9900"/>
         </w:rPr>
+        <w:lastRenderedPageBreak/>
         <w:t>Using materials: the Inventory Employee records what was used and on which project (e.g. 20 bags of cement to Santos Residence). The Inventory Supervisor approves it; then the stock goes down and the cost is added to that project.</w:t>
       </w:r>
     </w:p>

</xml_diff>